<commit_message>
LMS Documentation image updated
</commit_message>
<xml_diff>
--- a/Library Management System/Library Management System.docx
+++ b/Library Management System/Library Management System.docx
@@ -935,9 +935,9 @@
         </w:rPr>
         <w:drawing>
           <wp:inline distT="0" distB="0" distL="0" distR="0">
-            <wp:extent cx="4230841" cy="6891866"/>
+            <wp:extent cx="4953663" cy="6215623"/>
             <wp:effectExtent l="0" t="0" r="0" b="0"/>
-            <wp:docPr id="1585532488" name="Picture 1"/>
+            <wp:docPr id="59481079" name="Picture 1"/>
             <wp:cNvGraphicFramePr>
               <a:graphicFrameLocks xmlns:a="http://schemas.openxmlformats.org/drawingml/2006/main" noChangeAspect="1"/>
             </wp:cNvGraphicFramePr>
@@ -945,12 +945,11 @@
               <a:graphicData uri="http://schemas.openxmlformats.org/drawingml/2006/picture">
                 <pic:pic xmlns:pic="http://schemas.openxmlformats.org/drawingml/2006/picture">
                   <pic:nvPicPr>
-                    <pic:cNvPr id="1585532488" name="Picture 1585532488"/>
+                    <pic:cNvPr id="59481079" name="Picture 59481079"/>
                     <pic:cNvPicPr/>
                   </pic:nvPicPr>
                   <pic:blipFill>
-                    <a:blip r:embed="rId5" cstate="print">
-                      <a:biLevel thresh="75000"/>
+                    <a:blip r:embed="rId5">
                       <a:extLst>
                         <a:ext uri="{28A0092B-C50C-407E-A947-70E740481C1C}">
                           <a14:useLocalDpi xmlns:a14="http://schemas.microsoft.com/office/drawing/2010/main" val="0"/>
@@ -964,7 +963,7 @@
                   <pic:spPr>
                     <a:xfrm>
                       <a:off x="0" y="0"/>
-                      <a:ext cx="4244492" cy="6914102"/>
+                      <a:ext cx="4984644" cy="6254497"/>
                     </a:xfrm>
                     <a:prstGeom prst="rect">
                       <a:avLst/>
@@ -1321,9 +1320,9 @@
         </w:rPr>
         <w:drawing>
           <wp:inline distT="0" distB="0" distL="0" distR="0">
-            <wp:extent cx="3894667" cy="7852346"/>
+            <wp:extent cx="4810539" cy="7556920"/>
             <wp:effectExtent l="0" t="0" r="0" b="0"/>
-            <wp:docPr id="1261948020" name="Picture 2"/>
+            <wp:docPr id="2130021581" name="Picture 3"/>
             <wp:cNvGraphicFramePr>
               <a:graphicFrameLocks xmlns:a="http://schemas.openxmlformats.org/drawingml/2006/main" noChangeAspect="1"/>
             </wp:cNvGraphicFramePr>
@@ -1331,11 +1330,11 @@
               <a:graphicData uri="http://schemas.openxmlformats.org/drawingml/2006/picture">
                 <pic:pic xmlns:pic="http://schemas.openxmlformats.org/drawingml/2006/picture">
                   <pic:nvPicPr>
-                    <pic:cNvPr id="1261948020" name="Picture 1261948020"/>
+                    <pic:cNvPr id="2130021581" name="Picture 2130021581"/>
                     <pic:cNvPicPr/>
                   </pic:nvPicPr>
                   <pic:blipFill>
-                    <a:blip r:embed="rId6" cstate="print">
+                    <a:blip r:embed="rId6">
                       <a:extLst>
                         <a:ext uri="{28A0092B-C50C-407E-A947-70E740481C1C}">
                           <a14:useLocalDpi xmlns:a14="http://schemas.microsoft.com/office/drawing/2010/main" val="0"/>
@@ -1349,7 +1348,7 @@
                   <pic:spPr>
                     <a:xfrm>
                       <a:off x="0" y="0"/>
-                      <a:ext cx="3931913" cy="7927441"/>
+                      <a:ext cx="4859090" cy="7633189"/>
                     </a:xfrm>
                     <a:prstGeom prst="rect">
                       <a:avLst/>
@@ -1604,6 +1603,7 @@
           <w:rFonts w:ascii="Times New Roman" w:hAnsi="Times New Roman" w:cs="Times New Roman"/>
         </w:rPr>
       </w:pPr>
+      <w:proofErr w:type="spellStart"/>
       <w:r>
         <w:rPr>
           <w:rStyle w:val="VerbatimChar"/>
@@ -1611,6 +1611,7 @@
         </w:rPr>
         <w:t>member_id</w:t>
       </w:r>
+      <w:proofErr w:type="spellEnd"/>
       <w:r>
         <w:rPr>
           <w:rFonts w:ascii="Times New Roman" w:hAnsi="Times New Roman" w:cs="Times New Roman"/>
@@ -1629,6 +1630,7 @@
           <w:rFonts w:ascii="Times New Roman" w:hAnsi="Times New Roman" w:cs="Times New Roman"/>
         </w:rPr>
       </w:pPr>
+      <w:proofErr w:type="spellStart"/>
       <w:r>
         <w:rPr>
           <w:rStyle w:val="VerbatimChar"/>
@@ -1636,6 +1638,7 @@
         </w:rPr>
         <w:t>librarian_id</w:t>
       </w:r>
+      <w:proofErr w:type="spellEnd"/>
       <w:r>
         <w:rPr>
           <w:rFonts w:ascii="Times New Roman" w:hAnsi="Times New Roman" w:cs="Times New Roman"/>
@@ -1654,6 +1657,7 @@
           <w:rFonts w:ascii="Times New Roman" w:hAnsi="Times New Roman" w:cs="Times New Roman"/>
         </w:rPr>
       </w:pPr>
+      <w:proofErr w:type="spellStart"/>
       <w:r>
         <w:rPr>
           <w:rStyle w:val="VerbatimChar"/>
@@ -1661,6 +1665,7 @@
         </w:rPr>
         <w:t>book_id</w:t>
       </w:r>
+      <w:proofErr w:type="spellEnd"/>
       <w:r>
         <w:rPr>
           <w:rFonts w:ascii="Times New Roman" w:hAnsi="Times New Roman" w:cs="Times New Roman"/>
@@ -1679,6 +1684,7 @@
           <w:rFonts w:ascii="Times New Roman" w:hAnsi="Times New Roman" w:cs="Times New Roman"/>
         </w:rPr>
       </w:pPr>
+      <w:proofErr w:type="spellStart"/>
       <w:r>
         <w:rPr>
           <w:rStyle w:val="VerbatimChar"/>
@@ -1686,6 +1692,7 @@
         </w:rPr>
         <w:t>transaction_id</w:t>
       </w:r>
+      <w:proofErr w:type="spellEnd"/>
       <w:r>
         <w:rPr>
           <w:rFonts w:ascii="Times New Roman" w:hAnsi="Times New Roman" w:cs="Times New Roman"/>
@@ -1704,6 +1711,7 @@
           <w:rFonts w:ascii="Times New Roman" w:hAnsi="Times New Roman" w:cs="Times New Roman"/>
         </w:rPr>
       </w:pPr>
+      <w:proofErr w:type="spellStart"/>
       <w:r>
         <w:rPr>
           <w:rStyle w:val="VerbatimChar"/>
@@ -1711,6 +1719,7 @@
         </w:rPr>
         <w:t>fine_id</w:t>
       </w:r>
+      <w:proofErr w:type="spellEnd"/>
       <w:r>
         <w:rPr>
           <w:rFonts w:ascii="Times New Roman" w:hAnsi="Times New Roman" w:cs="Times New Roman"/>
@@ -1794,9 +1803,9 @@
         </w:rPr>
         <w:drawing>
           <wp:inline distT="0" distB="0" distL="0" distR="0">
-            <wp:extent cx="6198167" cy="6993466"/>
+            <wp:extent cx="6264275" cy="4707172"/>
             <wp:effectExtent l="0" t="0" r="0" b="0"/>
-            <wp:docPr id="1482667189" name="Picture 3"/>
+            <wp:docPr id="1024231387" name="Picture 4"/>
             <wp:cNvGraphicFramePr>
               <a:graphicFrameLocks xmlns:a="http://schemas.openxmlformats.org/drawingml/2006/main" noChangeAspect="1"/>
             </wp:cNvGraphicFramePr>
@@ -1804,11 +1813,11 @@
               <a:graphicData uri="http://schemas.openxmlformats.org/drawingml/2006/picture">
                 <pic:pic xmlns:pic="http://schemas.openxmlformats.org/drawingml/2006/picture">
                   <pic:nvPicPr>
-                    <pic:cNvPr id="1482667189" name="Picture 1482667189"/>
+                    <pic:cNvPr id="1024231387" name="Picture 1024231387"/>
                     <pic:cNvPicPr/>
                   </pic:nvPicPr>
                   <pic:blipFill>
-                    <a:blip r:embed="rId7" cstate="print">
+                    <a:blip r:embed="rId7">
                       <a:extLst>
                         <a:ext uri="{28A0092B-C50C-407E-A947-70E740481C1C}">
                           <a14:useLocalDpi xmlns:a14="http://schemas.microsoft.com/office/drawing/2010/main" val="0"/>
@@ -1822,7 +1831,7 @@
                   <pic:spPr>
                     <a:xfrm>
                       <a:off x="0" y="0"/>
-                      <a:ext cx="6211591" cy="7008613"/>
+                      <a:ext cx="6366978" cy="4784346"/>
                     </a:xfrm>
                     <a:prstGeom prst="rect">
                       <a:avLst/>

</xml_diff>